<commit_message>
Update downloadable resume with corrected version
Fix spelling and wording, change the contract count from 4 to 5 to match
the ₹6.01 crore total, and list each contract once.

Co-Authored-By: Claude Opus 5.5 <noreply@anthropic.com>
Claude-Session: https://claude.ai/code/session_013UyyijYyJ4sxi2dBgmcKP7
</commit_message>
<xml_diff>
--- a/assets/Vedant_Nemade_Resume.docx
+++ b/assets/Vedant_Nemade_Resume.docx
@@ -64,79 +64,7 @@
           <w:sz w:val="22"/>
           <w:szCs w:val="22"/>
         </w:rPr>
-        <w:t>Bhusawal</w:t>
-      </w:r>
-      <w:r>
-        <w:rPr>
-          <w:rFonts w:ascii="Calibri" w:hAnsi="Calibri" w:cs="Calibri"/>
-          <w:color w:val="5A5A5A"/>
-          <w:sz w:val="22"/>
-          <w:szCs w:val="22"/>
-        </w:rPr>
-        <w:t xml:space="preserve"> |</w:t>
-      </w:r>
-      <w:r>
-        <w:rPr>
-          <w:rFonts w:ascii="Calibri" w:hAnsi="Calibri" w:cs="Calibri"/>
-          <w:color w:val="5A5A5A"/>
-          <w:sz w:val="22"/>
-          <w:szCs w:val="22"/>
-        </w:rPr>
-        <w:t xml:space="preserve"> Maharashtra</w:t>
-      </w:r>
-      <w:r>
-        <w:rPr>
-          <w:rFonts w:ascii="Calibri" w:hAnsi="Calibri" w:cs="Calibri"/>
-          <w:color w:val="5A5A5A"/>
-          <w:sz w:val="22"/>
-          <w:szCs w:val="22"/>
-        </w:rPr>
-        <w:t xml:space="preserve"> |</w:t>
-      </w:r>
-      <w:r>
-        <w:rPr>
-          <w:rFonts w:ascii="Calibri" w:hAnsi="Calibri" w:cs="Calibri"/>
-          <w:color w:val="5A5A5A"/>
-          <w:sz w:val="22"/>
-          <w:szCs w:val="22"/>
-        </w:rPr>
-        <w:t xml:space="preserve"> </w:t>
-      </w:r>
-      <w:r>
-        <w:rPr>
-          <w:rFonts w:ascii="Calibri" w:hAnsi="Calibri" w:cs="Calibri"/>
-          <w:color w:val="5A5A5A"/>
-          <w:sz w:val="22"/>
-          <w:szCs w:val="22"/>
-        </w:rPr>
-        <w:t xml:space="preserve">+91 </w:t>
-      </w:r>
-      <w:r>
-        <w:rPr>
-          <w:rFonts w:ascii="Calibri" w:hAnsi="Calibri" w:cs="Calibri"/>
-          <w:color w:val="5A5A5A"/>
-          <w:sz w:val="22"/>
-          <w:szCs w:val="22"/>
-        </w:rPr>
-        <w:t>9529072284</w:t>
-      </w:r>
-      <w:r>
-        <w:rPr>
-          <w:rFonts w:ascii="Calibri" w:hAnsi="Calibri" w:cs="Calibri"/>
-          <w:color w:val="5A5A5A"/>
-          <w:sz w:val="22"/>
-          <w:szCs w:val="22"/>
-        </w:rPr>
-        <w:t xml:space="preserve"> |</w:t>
-      </w:r>
-      <w:r>
-        <w:rPr>
-          <w:rFonts w:ascii="Calibri" w:hAnsi="Calibri" w:cs="Calibri"/>
-          <w:color w:val="5A5A5A"/>
-          <w:sz w:val="22"/>
-          <w:szCs w:val="22"/>
-        </w:rPr>
-        <w:t xml:space="preserve"> </w:t>
+        <w:t xml:space="preserve">Bhusawal | Maharashtra | +91 9529072284 | </w:t>
       </w:r>
       <w:hyperlink r:id="rId5" w:history="1">
         <w:r>
@@ -191,72 +119,7 @@
           <w:sz w:val="22"/>
           <w:szCs w:val="22"/>
         </w:rPr>
-        <w:t xml:space="preserve">Civil Engineering student </w:t>
-      </w:r>
-      <w:proofErr w:type="gramStart"/>
-      <w:r>
-        <w:rPr>
-          <w:rFonts w:ascii="Calibri" w:hAnsi="Calibri" w:cs="Calibri"/>
-          <w:color w:val="1A1A1A"/>
-          <w:sz w:val="22"/>
-          <w:szCs w:val="22"/>
-        </w:rPr>
-        <w:t>B.Tech</w:t>
-      </w:r>
-      <w:proofErr w:type="gramEnd"/>
-      <w:r>
-        <w:rPr>
-          <w:rFonts w:ascii="Calibri" w:hAnsi="Calibri" w:cs="Calibri"/>
-          <w:color w:val="1A1A1A"/>
-          <w:sz w:val="22"/>
-          <w:szCs w:val="22"/>
-        </w:rPr>
-        <w:t>, expected Aug 2027 with hands-on site supervision experience across road and paving contracts worth a combined ₹</w:t>
-      </w:r>
-      <w:r>
-        <w:rPr>
-          <w:rFonts w:ascii="Calibri" w:hAnsi="Calibri" w:cs="Calibri"/>
-          <w:color w:val="1A1A1A"/>
-          <w:sz w:val="22"/>
-          <w:szCs w:val="22"/>
-        </w:rPr>
-        <w:t>6.</w:t>
-      </w:r>
-      <w:r>
-        <w:rPr>
-          <w:rFonts w:ascii="Calibri" w:hAnsi="Calibri" w:cs="Calibri"/>
-          <w:color w:val="1A1A1A"/>
-          <w:sz w:val="22"/>
-          <w:szCs w:val="22"/>
-        </w:rPr>
-        <w:t>01</w:t>
-      </w:r>
-      <w:r>
-        <w:rPr>
-          <w:rFonts w:ascii="Calibri" w:hAnsi="Calibri" w:cs="Calibri"/>
-          <w:color w:val="1A1A1A"/>
-          <w:sz w:val="22"/>
-          <w:szCs w:val="22"/>
-        </w:rPr>
-        <w:t xml:space="preserve">+ crore. Seeking a construction management </w:t>
-      </w:r>
-      <w:r>
-        <w:rPr>
-          <w:rFonts w:ascii="Calibri" w:hAnsi="Calibri" w:cs="Calibri"/>
-          <w:color w:val="1A1A1A"/>
-          <w:sz w:val="22"/>
-          <w:szCs w:val="22"/>
-        </w:rPr>
-        <w:t>job</w:t>
-      </w:r>
-      <w:r>
-        <w:rPr>
-          <w:rFonts w:ascii="Calibri" w:hAnsi="Calibri" w:cs="Calibri"/>
-          <w:color w:val="1A1A1A"/>
-          <w:sz w:val="22"/>
-          <w:szCs w:val="22"/>
-        </w:rPr>
-        <w:t>.</w:t>
+        <w:t xml:space="preserve">B.Tech Civil Engineering student (graduating Aug 2027) with hands-on site supervision experience across road and paving contracts worth a combined ₹6.01+ crore. Seeking a construction management job.</w:t>
       </w:r>
     </w:p>
     <w:p>
@@ -377,50 +240,8 @@
           <w:szCs w:val="22"/>
         </w:rPr>
         <w:t>Pooja Construction</w:t>
-      </w:r>
-      <w:r>
-        <w:rPr>
-          <w:rFonts w:ascii="Calibri" w:hAnsi="Calibri" w:cs="Calibri"/>
-          <w:b/>
-          <w:bCs/>
-          <w:color w:val="000000" w:themeColor="text1"/>
-          <w:sz w:val="22"/>
-          <w:szCs w:val="22"/>
-        </w:rPr>
         <w:tab/>
-      </w:r>
-      <w:r>
-        <w:rPr>
-          <w:rFonts w:ascii="Calibri" w:hAnsi="Calibri" w:cs="Calibri"/>
-          <w:b/>
-          <w:bCs/>
-          <w:color w:val="000000" w:themeColor="text1"/>
-          <w:sz w:val="22"/>
-          <w:szCs w:val="22"/>
-        </w:rPr>
-        <w:t xml:space="preserve">December </w:t>
-      </w:r>
-      <w:r>
-        <w:rPr>
-          <w:rFonts w:ascii="Calibri" w:hAnsi="Calibri" w:cs="Calibri"/>
-          <w:b/>
-          <w:bCs/>
-          <w:color w:val="000000" w:themeColor="text1"/>
-          <w:sz w:val="22"/>
-          <w:szCs w:val="22"/>
-        </w:rPr>
-        <w:t xml:space="preserve">2023 — </w:t>
-      </w:r>
-      <w:r>
-        <w:rPr>
-          <w:rFonts w:ascii="Calibri" w:hAnsi="Calibri" w:cs="Calibri"/>
-          <w:b/>
-          <w:bCs/>
-          <w:color w:val="000000" w:themeColor="text1"/>
-          <w:sz w:val="22"/>
-          <w:szCs w:val="22"/>
-        </w:rPr>
-        <w:t>Current</w:t>
+        <w:t xml:space="preserve">December 2023 — Current</w:t>
       </w:r>
     </w:p>
     <w:p>
@@ -446,40 +267,7 @@
           <w:sz w:val="22"/>
           <w:szCs w:val="22"/>
         </w:rPr>
-        <w:t>Supervised execution of 4 major road and paving contracts, combined value ~₹</w:t>
-      </w:r>
-      <w:r>
-        <w:rPr>
-          <w:rFonts w:ascii="Calibri" w:hAnsi="Calibri" w:cs="Calibri"/>
-          <w:i/>
-          <w:iCs/>
-          <w:color w:val="1A1A1A"/>
-          <w:sz w:val="22"/>
-          <w:szCs w:val="22"/>
-        </w:rPr>
-        <w:t>6.</w:t>
-      </w:r>
-      <w:r>
-        <w:rPr>
-          <w:rFonts w:ascii="Calibri" w:hAnsi="Calibri" w:cs="Calibri"/>
-          <w:i/>
-          <w:iCs/>
-          <w:color w:val="1A1A1A"/>
-          <w:sz w:val="22"/>
-          <w:szCs w:val="22"/>
-        </w:rPr>
-        <w:t>01</w:t>
-      </w:r>
-      <w:r>
-        <w:rPr>
-          <w:rFonts w:ascii="Calibri" w:hAnsi="Calibri" w:cs="Calibri"/>
-          <w:i/>
-          <w:iCs/>
-          <w:color w:val="1A1A1A"/>
-          <w:sz w:val="22"/>
-          <w:szCs w:val="22"/>
-        </w:rPr>
-        <w:t xml:space="preserve"> crore:</w:t>
+        <w:t xml:space="preserve">Supervised execution of 5 major road and paving contracts, combined value ~₹6.01 crore:</w:t>
       </w:r>
     </w:p>
     <w:p>
@@ -503,7 +291,7 @@
           <w:sz w:val="22"/>
           <w:szCs w:val="22"/>
         </w:rPr>
-        <w:t>MDR-58 to Kumbharkheda–Chinawal–Vaghoda–Nimbhora Road (MDR-73, km 8/00–13/00), Tal. Raver — ₹1,42,64,247</w:t>
+        <w:t xml:space="preserve">MDR-58 to Kumbharkheda–Chinawal–Vaghoda–Nimbhora Road (MDR-73, km 8/00–13/00), Tal. Raver — ₹1,42,64,247</w:t>
       </w:r>
     </w:p>
     <w:p>
@@ -527,7 +315,7 @@
           <w:sz w:val="22"/>
           <w:szCs w:val="22"/>
         </w:rPr>
-        <w:t>Concrete road / paver block construction across Prabhag No. 5, 6 &amp; 7, Bhusawal — ₹1,25,89,328</w:t>
+        <w:t xml:space="preserve">Asphalting of roads, Prabhag No. 6, Bhusawal — ₹19,39,437</w:t>
       </w:r>
     </w:p>
     <w:p>
@@ -551,7 +339,7 @@
           <w:sz w:val="22"/>
           <w:szCs w:val="22"/>
         </w:rPr>
-        <w:t>Asphalting of roads, Prabhag No. 6, Bhusawal — ₹19,39,437</w:t>
+        <w:t xml:space="preserve">STBT road from Nahata College to HDFC Bank Road in Bhusawal Municipal Corporation limits. Tal-Bhusawal Dist-Jalgaon — ₹1,85,78,524</w:t>
       </w:r>
     </w:p>
     <w:p>
@@ -571,11 +359,19 @@
       <w:r>
         <w:rPr>
           <w:rFonts w:ascii="Calibri" w:hAnsi="Calibri" w:cs="Calibri"/>
+          <w:sz w:val="22"/>
+          <w:szCs w:val="22"/>
+        </w:rPr>
+        <w:t xml:space="preserve">A) Construction of Concrete Roads / Fixing Paver Block in Sukdev Patil Nagar Parisar and Ganesh Vihar Parisar at Prabhag No. 7, B) Construction of Concrete Road / Fixing Paver Block in Digambar Ahire to Branch Ground Premises at Prabhag No. 5. C) Asphalting and Concreting / Fixing Paver Block of Roads in Bhalchandra Nagar and Various Areas at Prabhag No. 6. Tal-Bhusawal Dist-Jalgaon — </w:t>
+      </w:r>
+      <w:r>
+        <w:rPr>
+          <w:rFonts w:ascii="Calibri" w:hAnsi="Calibri" w:cs="Calibri"/>
           <w:color w:val="1A1A1A"/>
           <w:sz w:val="22"/>
           <w:szCs w:val="22"/>
         </w:rPr>
-        <w:t>STBT To Nahata College to HDFC Bank Road in Bhusawal Munciopal Corporation Limits. Tal-Bhusawal Dist-Jalgaon –– ₹1,85,78,524</w:t>
+        <w:t>₹1,25,89,328</w:t>
       </w:r>
     </w:p>
     <w:p>
@@ -598,7 +394,7 @@
           <w:sz w:val="22"/>
           <w:szCs w:val="22"/>
         </w:rPr>
-        <w:t xml:space="preserve">A) Construction Of Concreting / Fixing Paver Block in Sukdev Patil Nagar Parisar and Ganesh Vihar Parisar at Prabhag No.7, B) Construction of Concret Road / Fixing Paver Block in Digambar Ahire to Branch Ground Premises at Prabhag No.5. C) Asphalting And Concreting / Fixing Paver Block of Roads in Bhalchandra Nagar and Various Areas at Prabhag No.6. Tal-Bhusawal Dist-Jalgaon –– </w:t>
+        <w:t xml:space="preserve">A) Asphalting of roads in Ward No. 5 Magasvargiya Wasti at Mauje Kandari. B) Asphalting of roads in Amarnath Nagar, Vaishnav Nagar, Gulmohar Nagar, Somnath Nagar, Saidutt Nagar and Gajanan Park Magasvargiya areas near Bhusawal. Tal-Bhusawal Dist-Jalgaon — </w:t>
       </w:r>
       <w:r>
         <w:rPr>
@@ -607,7 +403,15 @@
           <w:sz w:val="22"/>
           <w:szCs w:val="22"/>
         </w:rPr>
-        <w:t>₹1,25,89,328</w:t>
+        <w:t>₹</w:t>
+      </w:r>
+      <w:r>
+        <w:rPr>
+          <w:rFonts w:ascii="Calibri" w:hAnsi="Calibri" w:cs="Calibri"/>
+          <w:sz w:val="22"/>
+          <w:szCs w:val="22"/>
+        </w:rPr>
+        <w:t>1,27,44,128</w:t>
       </w:r>
     </w:p>
     <w:p>
@@ -624,31 +428,6 @@
           <w:szCs w:val="22"/>
         </w:rPr>
       </w:pPr>
-      <w:r>
-        <w:rPr>
-          <w:rFonts w:ascii="Calibri" w:hAnsi="Calibri" w:cs="Calibri"/>
-          <w:sz w:val="22"/>
-          <w:szCs w:val="22"/>
-        </w:rPr>
-        <w:t xml:space="preserve">A) Asphalting of roads in ward no.5 Magasvargiy Wasti at Mauje Kandari.B) Asphalting of roads in Amarnath Nagar, Vaishnav Nagar, Gulmohar Gulmo Nagar, Somnath Nagar, Saidutt Nagar and Gajanan Park Magasvargiy areas near Bhusawal. Tal-Bhusaval Dist-Jalgaon –– </w:t>
-      </w:r>
-      <w:r>
-        <w:rPr>
-          <w:rFonts w:ascii="Calibri" w:hAnsi="Calibri" w:cs="Calibri"/>
-          <w:color w:val="1A1A1A"/>
-          <w:sz w:val="22"/>
-          <w:szCs w:val="22"/>
-        </w:rPr>
-        <w:t>₹</w:t>
-      </w:r>
-      <w:r>
-        <w:rPr>
-          <w:rFonts w:ascii="Calibri" w:hAnsi="Calibri" w:cs="Calibri"/>
-          <w:sz w:val="22"/>
-          <w:szCs w:val="22"/>
-        </w:rPr>
-        <w:t>1,27,44,128</w:t>
-      </w:r>
     </w:p>
     <w:p>
       <w:pPr>
@@ -717,25 +496,7 @@
           <w:sz w:val="22"/>
           <w:szCs w:val="22"/>
         </w:rPr>
-        <w:t>Supervised on-site workforce of 11–2</w:t>
-      </w:r>
-      <w:r>
-        <w:rPr>
-          <w:rFonts w:ascii="Calibri" w:hAnsi="Calibri" w:cs="Calibri"/>
-          <w:color w:val="1A1A1A"/>
-          <w:sz w:val="22"/>
-          <w:szCs w:val="22"/>
-        </w:rPr>
-        <w:t>5</w:t>
-      </w:r>
-      <w:r>
-        <w:rPr>
-          <w:rFonts w:ascii="Calibri" w:hAnsi="Calibri" w:cs="Calibri"/>
-          <w:color w:val="1A1A1A"/>
-          <w:sz w:val="22"/>
-          <w:szCs w:val="22"/>
-        </w:rPr>
-        <w:t xml:space="preserve"> workers per project</w:t>
+        <w:t xml:space="preserve">Supervised on-site workforce of 11–25 workers per project</w:t>
       </w:r>
     </w:p>
     <w:p>
@@ -836,7 +597,6 @@
           <w:szCs w:val="22"/>
         </w:rPr>
       </w:pPr>
-      <w:proofErr w:type="gramStart"/>
       <w:r>
         <w:rPr>
           <w:rFonts w:ascii="Calibri" w:hAnsi="Calibri" w:cs="Calibri"/>
@@ -846,19 +606,7 @@
           <w:sz w:val="22"/>
           <w:szCs w:val="22"/>
         </w:rPr>
-        <w:t>B.Tech</w:t>
-      </w:r>
-      <w:proofErr w:type="gramEnd"/>
-      <w:r>
-        <w:rPr>
-          <w:rFonts w:ascii="Calibri" w:hAnsi="Calibri" w:cs="Calibri"/>
-          <w:b/>
-          <w:bCs/>
-          <w:color w:val="1A1A1A"/>
-          <w:sz w:val="22"/>
-          <w:szCs w:val="22"/>
-        </w:rPr>
-        <w:t xml:space="preserve"> in Civil Engineering, Hindi Seva Mandal's Shri Sant Gadge Baba College of Engineering and Technology</w:t>
+        <w:t xml:space="preserve">B.Tech in Civil Engineering, Hindi Seva Mandal's Shri Sant Gadge Baba College of Engineering and Technology</w:t>
       </w:r>
       <w:r>
         <w:rPr>
@@ -908,43 +656,7 @@
           <w:sz w:val="22"/>
           <w:szCs w:val="22"/>
         </w:rPr>
-        <w:t>CGPA: 7.0</w:t>
-      </w:r>
-      <w:r>
-        <w:rPr>
-          <w:rFonts w:ascii="Calibri" w:hAnsi="Calibri" w:cs="Calibri"/>
-          <w:color w:val="5A5A5A"/>
-          <w:sz w:val="22"/>
-          <w:szCs w:val="22"/>
-        </w:rPr>
-        <w:t>/10</w:t>
-      </w:r>
-      <w:r>
-        <w:rPr>
-          <w:rFonts w:ascii="Calibri" w:hAnsi="Calibri" w:cs="Calibri"/>
-          <w:color w:val="5A5A5A"/>
-          <w:sz w:val="22"/>
-          <w:szCs w:val="22"/>
-        </w:rPr>
-        <w:t xml:space="preserve"> (through </w:t>
-      </w:r>
-      <w:r>
-        <w:rPr>
-          <w:rFonts w:ascii="Calibri" w:hAnsi="Calibri" w:cs="Calibri"/>
-          <w:color w:val="5A5A5A"/>
-          <w:sz w:val="22"/>
-          <w:szCs w:val="22"/>
-        </w:rPr>
-        <w:t>6</w:t>
-      </w:r>
-      <w:r>
-        <w:rPr>
-          <w:rFonts w:ascii="Calibri" w:hAnsi="Calibri" w:cs="Calibri"/>
-          <w:color w:val="5A5A5A"/>
-          <w:sz w:val="22"/>
-          <w:szCs w:val="22"/>
-        </w:rPr>
-        <w:t>th semester)</w:t>
+        <w:t xml:space="preserve">CGPA: 7.0/10 (through 6th semester)</w:t>
       </w:r>
     </w:p>
     <w:p>
@@ -969,29 +681,7 @@
           <w:sz w:val="22"/>
           <w:szCs w:val="22"/>
         </w:rPr>
-        <w:t>Bachelor of Commerce, Dadasaheb Devidas Namdeo Bhole College</w:t>
-      </w:r>
-      <w:r>
-        <w:rPr>
-          <w:rFonts w:ascii="Calibri" w:hAnsi="Calibri" w:cs="Calibri"/>
-          <w:b/>
-          <w:bCs/>
-          <w:color w:val="1A1A1A"/>
-          <w:sz w:val="22"/>
-          <w:szCs w:val="22"/>
-        </w:rPr>
-        <w:t xml:space="preserve"> </w:t>
-      </w:r>
-      <w:r>
-        <w:rPr>
-          <w:rFonts w:ascii="Calibri" w:hAnsi="Calibri" w:cs="Calibri"/>
-          <w:b/>
-          <w:bCs/>
-          <w:color w:val="1A1A1A"/>
-          <w:sz w:val="22"/>
-          <w:szCs w:val="22"/>
-        </w:rPr>
-        <w:t>(Private / External Mode)</w:t>
+        <w:t xml:space="preserve">Bachelor of Commerce, Dadasaheb Devidas Namdeo Bhole College (Private / External Mode)</w:t>
       </w:r>
       <w:r>
         <w:rPr>
@@ -1170,6 +860,119 @@
     </w:lvl>
   </w:abstractNum>
   <w:abstractNum w:abstractNumId="1" w15:restartNumberingAfterBreak="0">
+    <w:nsid w:val="36976CE2"/>
+    <w:multiLevelType w:val="hybridMultilevel"/>
+    <w:tmpl w:val="D42AC646"/>
+    <w:lvl w:ilvl="0" w:tplc="04090001">
+      <w:start w:val="1"/>
+      <w:numFmt w:val="bullet"/>
+      <w:lvlText w:val=""/>
+      <w:lvlJc w:val="left"/>
+      <w:pPr>
+        <w:ind w:left="720" w:hanging="360"/>
+      </w:pPr>
+      <w:rPr>
+        <w:rFonts w:ascii="Symbol" w:hAnsi="Symbol" w:hint="default"/>
+      </w:rPr>
+    </w:lvl>
+    <w:lvl w:ilvl="1" w:tplc="04090003" w:tentative="1">
+      <w:start w:val="1"/>
+      <w:numFmt w:val="bullet"/>
+      <w:lvlText w:val="o"/>
+      <w:lvlJc w:val="left"/>
+      <w:pPr>
+        <w:ind w:left="1440" w:hanging="360"/>
+      </w:pPr>
+      <w:rPr>
+        <w:rFonts w:ascii="Courier New" w:hAnsi="Courier New" w:cs="Courier New" w:hint="default"/>
+      </w:rPr>
+    </w:lvl>
+    <w:lvl w:ilvl="2" w:tplc="04090005" w:tentative="1">
+      <w:start w:val="1"/>
+      <w:numFmt w:val="bullet"/>
+      <w:lvlText w:val=""/>
+      <w:lvlJc w:val="left"/>
+      <w:pPr>
+        <w:ind w:left="2160" w:hanging="360"/>
+      </w:pPr>
+      <w:rPr>
+        <w:rFonts w:ascii="Wingdings" w:hAnsi="Wingdings" w:hint="default"/>
+      </w:rPr>
+    </w:lvl>
+    <w:lvl w:ilvl="3" w:tplc="04090001" w:tentative="1">
+      <w:start w:val="1"/>
+      <w:numFmt w:val="bullet"/>
+      <w:lvlText w:val=""/>
+      <w:lvlJc w:val="left"/>
+      <w:pPr>
+        <w:ind w:left="2880" w:hanging="360"/>
+      </w:pPr>
+      <w:rPr>
+        <w:rFonts w:ascii="Symbol" w:hAnsi="Symbol" w:hint="default"/>
+      </w:rPr>
+    </w:lvl>
+    <w:lvl w:ilvl="4" w:tplc="04090003" w:tentative="1">
+      <w:start w:val="1"/>
+      <w:numFmt w:val="bullet"/>
+      <w:lvlText w:val="o"/>
+      <w:lvlJc w:val="left"/>
+      <w:pPr>
+        <w:ind w:left="3600" w:hanging="360"/>
+      </w:pPr>
+      <w:rPr>
+        <w:rFonts w:ascii="Courier New" w:hAnsi="Courier New" w:cs="Courier New" w:hint="default"/>
+      </w:rPr>
+    </w:lvl>
+    <w:lvl w:ilvl="5" w:tplc="04090005" w:tentative="1">
+      <w:start w:val="1"/>
+      <w:numFmt w:val="bullet"/>
+      <w:lvlText w:val=""/>
+      <w:lvlJc w:val="left"/>
+      <w:pPr>
+        <w:ind w:left="4320" w:hanging="360"/>
+      </w:pPr>
+      <w:rPr>
+        <w:rFonts w:ascii="Wingdings" w:hAnsi="Wingdings" w:hint="default"/>
+      </w:rPr>
+    </w:lvl>
+    <w:lvl w:ilvl="6" w:tplc="04090001" w:tentative="1">
+      <w:start w:val="1"/>
+      <w:numFmt w:val="bullet"/>
+      <w:lvlText w:val=""/>
+      <w:lvlJc w:val="left"/>
+      <w:pPr>
+        <w:ind w:left="5040" w:hanging="360"/>
+      </w:pPr>
+      <w:rPr>
+        <w:rFonts w:ascii="Symbol" w:hAnsi="Symbol" w:hint="default"/>
+      </w:rPr>
+    </w:lvl>
+    <w:lvl w:ilvl="7" w:tplc="04090003" w:tentative="1">
+      <w:start w:val="1"/>
+      <w:numFmt w:val="bullet"/>
+      <w:lvlText w:val="o"/>
+      <w:lvlJc w:val="left"/>
+      <w:pPr>
+        <w:ind w:left="5760" w:hanging="360"/>
+      </w:pPr>
+      <w:rPr>
+        <w:rFonts w:ascii="Courier New" w:hAnsi="Courier New" w:cs="Courier New" w:hint="default"/>
+      </w:rPr>
+    </w:lvl>
+    <w:lvl w:ilvl="8" w:tplc="04090005" w:tentative="1">
+      <w:start w:val="1"/>
+      <w:numFmt w:val="bullet"/>
+      <w:lvlText w:val=""/>
+      <w:lvlJc w:val="left"/>
+      <w:pPr>
+        <w:ind w:left="6480" w:hanging="360"/>
+      </w:pPr>
+      <w:rPr>
+        <w:rFonts w:ascii="Wingdings" w:hAnsi="Wingdings" w:hint="default"/>
+      </w:rPr>
+    </w:lvl>
+  </w:abstractNum>
+  <w:abstractNum w:abstractNumId="2" w15:restartNumberingAfterBreak="0">
     <w:nsid w:val="38512EE6"/>
     <w:multiLevelType w:val="hybridMultilevel"/>
     <w:tmpl w:val="B7189D46"/>
@@ -1255,7 +1058,119 @@
       </w:pPr>
     </w:lvl>
   </w:abstractNum>
-  <w:abstractNum w:abstractNumId="2" w15:restartNumberingAfterBreak="0">
+  <w:abstractNum w:abstractNumId="3" w15:restartNumberingAfterBreak="0">
+    <w:nsid w:val="3F085019"/>
+    <w:multiLevelType w:val="hybridMultilevel"/>
+    <w:tmpl w:val="0B2E518E"/>
+    <w:lvl w:ilvl="0" w:tplc="681EE1AC">
+      <w:numFmt w:val="bullet"/>
+      <w:lvlText w:val="–"/>
+      <w:lvlJc w:val="left"/>
+      <w:pPr>
+        <w:ind w:left="660" w:hanging="360"/>
+      </w:pPr>
+      <w:rPr>
+        <w:rFonts w:ascii="Calibri" w:eastAsia="Times New Roman" w:hAnsi="Calibri" w:cs="Calibri" w:hint="default"/>
+      </w:rPr>
+    </w:lvl>
+    <w:lvl w:ilvl="1" w:tplc="04090003" w:tentative="1">
+      <w:start w:val="1"/>
+      <w:numFmt w:val="bullet"/>
+      <w:lvlText w:val="o"/>
+      <w:lvlJc w:val="left"/>
+      <w:pPr>
+        <w:ind w:left="1380" w:hanging="360"/>
+      </w:pPr>
+      <w:rPr>
+        <w:rFonts w:ascii="Courier New" w:hAnsi="Courier New" w:cs="Courier New" w:hint="default"/>
+      </w:rPr>
+    </w:lvl>
+    <w:lvl w:ilvl="2" w:tplc="04090005" w:tentative="1">
+      <w:start w:val="1"/>
+      <w:numFmt w:val="bullet"/>
+      <w:lvlText w:val=""/>
+      <w:lvlJc w:val="left"/>
+      <w:pPr>
+        <w:ind w:left="2100" w:hanging="360"/>
+      </w:pPr>
+      <w:rPr>
+        <w:rFonts w:ascii="Wingdings" w:hAnsi="Wingdings" w:hint="default"/>
+      </w:rPr>
+    </w:lvl>
+    <w:lvl w:ilvl="3" w:tplc="04090001" w:tentative="1">
+      <w:start w:val="1"/>
+      <w:numFmt w:val="bullet"/>
+      <w:lvlText w:val=""/>
+      <w:lvlJc w:val="left"/>
+      <w:pPr>
+        <w:ind w:left="2820" w:hanging="360"/>
+      </w:pPr>
+      <w:rPr>
+        <w:rFonts w:ascii="Symbol" w:hAnsi="Symbol" w:hint="default"/>
+      </w:rPr>
+    </w:lvl>
+    <w:lvl w:ilvl="4" w:tplc="04090003" w:tentative="1">
+      <w:start w:val="1"/>
+      <w:numFmt w:val="bullet"/>
+      <w:lvlText w:val="o"/>
+      <w:lvlJc w:val="left"/>
+      <w:pPr>
+        <w:ind w:left="3540" w:hanging="360"/>
+      </w:pPr>
+      <w:rPr>
+        <w:rFonts w:ascii="Courier New" w:hAnsi="Courier New" w:cs="Courier New" w:hint="default"/>
+      </w:rPr>
+    </w:lvl>
+    <w:lvl w:ilvl="5" w:tplc="04090005" w:tentative="1">
+      <w:start w:val="1"/>
+      <w:numFmt w:val="bullet"/>
+      <w:lvlText w:val=""/>
+      <w:lvlJc w:val="left"/>
+      <w:pPr>
+        <w:ind w:left="4260" w:hanging="360"/>
+      </w:pPr>
+      <w:rPr>
+        <w:rFonts w:ascii="Wingdings" w:hAnsi="Wingdings" w:hint="default"/>
+      </w:rPr>
+    </w:lvl>
+    <w:lvl w:ilvl="6" w:tplc="04090001" w:tentative="1">
+      <w:start w:val="1"/>
+      <w:numFmt w:val="bullet"/>
+      <w:lvlText w:val=""/>
+      <w:lvlJc w:val="left"/>
+      <w:pPr>
+        <w:ind w:left="4980" w:hanging="360"/>
+      </w:pPr>
+      <w:rPr>
+        <w:rFonts w:ascii="Symbol" w:hAnsi="Symbol" w:hint="default"/>
+      </w:rPr>
+    </w:lvl>
+    <w:lvl w:ilvl="7" w:tplc="04090003" w:tentative="1">
+      <w:start w:val="1"/>
+      <w:numFmt w:val="bullet"/>
+      <w:lvlText w:val="o"/>
+      <w:lvlJc w:val="left"/>
+      <w:pPr>
+        <w:ind w:left="5700" w:hanging="360"/>
+      </w:pPr>
+      <w:rPr>
+        <w:rFonts w:ascii="Courier New" w:hAnsi="Courier New" w:cs="Courier New" w:hint="default"/>
+      </w:rPr>
+    </w:lvl>
+    <w:lvl w:ilvl="8" w:tplc="04090005" w:tentative="1">
+      <w:start w:val="1"/>
+      <w:numFmt w:val="bullet"/>
+      <w:lvlText w:val=""/>
+      <w:lvlJc w:val="left"/>
+      <w:pPr>
+        <w:ind w:left="6420" w:hanging="360"/>
+      </w:pPr>
+      <w:rPr>
+        <w:rFonts w:ascii="Wingdings" w:hAnsi="Wingdings" w:hint="default"/>
+      </w:rPr>
+    </w:lvl>
+  </w:abstractNum>
+  <w:abstractNum w:abstractNumId="4" w15:restartNumberingAfterBreak="0">
     <w:nsid w:val="474732E4"/>
     <w:multiLevelType w:val="hybridMultilevel"/>
     <w:tmpl w:val="02F8587C"/>
@@ -1368,7 +1283,233 @@
       </w:rPr>
     </w:lvl>
   </w:abstractNum>
-  <w:abstractNum w:abstractNumId="3" w15:restartNumberingAfterBreak="0">
+  <w:abstractNum w:abstractNumId="5" w15:restartNumberingAfterBreak="0">
+    <w:nsid w:val="5DE44E2A"/>
+    <w:multiLevelType w:val="hybridMultilevel"/>
+    <w:tmpl w:val="BB96ECC8"/>
+    <w:lvl w:ilvl="0" w:tplc="04090001">
+      <w:start w:val="1"/>
+      <w:numFmt w:val="bullet"/>
+      <w:lvlText w:val=""/>
+      <w:lvlJc w:val="left"/>
+      <w:pPr>
+        <w:ind w:left="1020" w:hanging="360"/>
+      </w:pPr>
+      <w:rPr>
+        <w:rFonts w:ascii="Symbol" w:hAnsi="Symbol" w:hint="default"/>
+      </w:rPr>
+    </w:lvl>
+    <w:lvl w:ilvl="1" w:tplc="04090003" w:tentative="1">
+      <w:start w:val="1"/>
+      <w:numFmt w:val="bullet"/>
+      <w:lvlText w:val="o"/>
+      <w:lvlJc w:val="left"/>
+      <w:pPr>
+        <w:ind w:left="1740" w:hanging="360"/>
+      </w:pPr>
+      <w:rPr>
+        <w:rFonts w:ascii="Courier New" w:hAnsi="Courier New" w:cs="Courier New" w:hint="default"/>
+      </w:rPr>
+    </w:lvl>
+    <w:lvl w:ilvl="2" w:tplc="04090005" w:tentative="1">
+      <w:start w:val="1"/>
+      <w:numFmt w:val="bullet"/>
+      <w:lvlText w:val=""/>
+      <w:lvlJc w:val="left"/>
+      <w:pPr>
+        <w:ind w:left="2460" w:hanging="360"/>
+      </w:pPr>
+      <w:rPr>
+        <w:rFonts w:ascii="Wingdings" w:hAnsi="Wingdings" w:hint="default"/>
+      </w:rPr>
+    </w:lvl>
+    <w:lvl w:ilvl="3" w:tplc="04090001" w:tentative="1">
+      <w:start w:val="1"/>
+      <w:numFmt w:val="bullet"/>
+      <w:lvlText w:val=""/>
+      <w:lvlJc w:val="left"/>
+      <w:pPr>
+        <w:ind w:left="3180" w:hanging="360"/>
+      </w:pPr>
+      <w:rPr>
+        <w:rFonts w:ascii="Symbol" w:hAnsi="Symbol" w:hint="default"/>
+      </w:rPr>
+    </w:lvl>
+    <w:lvl w:ilvl="4" w:tplc="04090003" w:tentative="1">
+      <w:start w:val="1"/>
+      <w:numFmt w:val="bullet"/>
+      <w:lvlText w:val="o"/>
+      <w:lvlJc w:val="left"/>
+      <w:pPr>
+        <w:ind w:left="3900" w:hanging="360"/>
+      </w:pPr>
+      <w:rPr>
+        <w:rFonts w:ascii="Courier New" w:hAnsi="Courier New" w:cs="Courier New" w:hint="default"/>
+      </w:rPr>
+    </w:lvl>
+    <w:lvl w:ilvl="5" w:tplc="04090005" w:tentative="1">
+      <w:start w:val="1"/>
+      <w:numFmt w:val="bullet"/>
+      <w:lvlText w:val=""/>
+      <w:lvlJc w:val="left"/>
+      <w:pPr>
+        <w:ind w:left="4620" w:hanging="360"/>
+      </w:pPr>
+      <w:rPr>
+        <w:rFonts w:ascii="Wingdings" w:hAnsi="Wingdings" w:hint="default"/>
+      </w:rPr>
+    </w:lvl>
+    <w:lvl w:ilvl="6" w:tplc="04090001" w:tentative="1">
+      <w:start w:val="1"/>
+      <w:numFmt w:val="bullet"/>
+      <w:lvlText w:val=""/>
+      <w:lvlJc w:val="left"/>
+      <w:pPr>
+        <w:ind w:left="5340" w:hanging="360"/>
+      </w:pPr>
+      <w:rPr>
+        <w:rFonts w:ascii="Symbol" w:hAnsi="Symbol" w:hint="default"/>
+      </w:rPr>
+    </w:lvl>
+    <w:lvl w:ilvl="7" w:tplc="04090003" w:tentative="1">
+      <w:start w:val="1"/>
+      <w:numFmt w:val="bullet"/>
+      <w:lvlText w:val="o"/>
+      <w:lvlJc w:val="left"/>
+      <w:pPr>
+        <w:ind w:left="6060" w:hanging="360"/>
+      </w:pPr>
+      <w:rPr>
+        <w:rFonts w:ascii="Courier New" w:hAnsi="Courier New" w:cs="Courier New" w:hint="default"/>
+      </w:rPr>
+    </w:lvl>
+    <w:lvl w:ilvl="8" w:tplc="04090005" w:tentative="1">
+      <w:start w:val="1"/>
+      <w:numFmt w:val="bullet"/>
+      <w:lvlText w:val=""/>
+      <w:lvlJc w:val="left"/>
+      <w:pPr>
+        <w:ind w:left="6780" w:hanging="360"/>
+      </w:pPr>
+      <w:rPr>
+        <w:rFonts w:ascii="Wingdings" w:hAnsi="Wingdings" w:hint="default"/>
+      </w:rPr>
+    </w:lvl>
+  </w:abstractNum>
+  <w:abstractNum w:abstractNumId="6" w15:restartNumberingAfterBreak="0">
+    <w:nsid w:val="62E963B2"/>
+    <w:multiLevelType w:val="hybridMultilevel"/>
+    <w:tmpl w:val="D44276EC"/>
+    <w:lvl w:ilvl="0" w:tplc="04090001">
+      <w:start w:val="1"/>
+      <w:numFmt w:val="bullet"/>
+      <w:lvlText w:val=""/>
+      <w:lvlJc w:val="left"/>
+      <w:pPr>
+        <w:ind w:left="1020" w:hanging="360"/>
+      </w:pPr>
+      <w:rPr>
+        <w:rFonts w:ascii="Symbol" w:hAnsi="Symbol" w:hint="default"/>
+      </w:rPr>
+    </w:lvl>
+    <w:lvl w:ilvl="1" w:tplc="04090003" w:tentative="1">
+      <w:start w:val="1"/>
+      <w:numFmt w:val="bullet"/>
+      <w:lvlText w:val="o"/>
+      <w:lvlJc w:val="left"/>
+      <w:pPr>
+        <w:ind w:left="1740" w:hanging="360"/>
+      </w:pPr>
+      <w:rPr>
+        <w:rFonts w:ascii="Courier New" w:hAnsi="Courier New" w:cs="Courier New" w:hint="default"/>
+      </w:rPr>
+    </w:lvl>
+    <w:lvl w:ilvl="2" w:tplc="04090005" w:tentative="1">
+      <w:start w:val="1"/>
+      <w:numFmt w:val="bullet"/>
+      <w:lvlText w:val=""/>
+      <w:lvlJc w:val="left"/>
+      <w:pPr>
+        <w:ind w:left="2460" w:hanging="360"/>
+      </w:pPr>
+      <w:rPr>
+        <w:rFonts w:ascii="Wingdings" w:hAnsi="Wingdings" w:hint="default"/>
+      </w:rPr>
+    </w:lvl>
+    <w:lvl w:ilvl="3" w:tplc="04090001" w:tentative="1">
+      <w:start w:val="1"/>
+      <w:numFmt w:val="bullet"/>
+      <w:lvlText w:val=""/>
+      <w:lvlJc w:val="left"/>
+      <w:pPr>
+        <w:ind w:left="3180" w:hanging="360"/>
+      </w:pPr>
+      <w:rPr>
+        <w:rFonts w:ascii="Symbol" w:hAnsi="Symbol" w:hint="default"/>
+      </w:rPr>
+    </w:lvl>
+    <w:lvl w:ilvl="4" w:tplc="04090003" w:tentative="1">
+      <w:start w:val="1"/>
+      <w:numFmt w:val="bullet"/>
+      <w:lvlText w:val="o"/>
+      <w:lvlJc w:val="left"/>
+      <w:pPr>
+        <w:ind w:left="3900" w:hanging="360"/>
+      </w:pPr>
+      <w:rPr>
+        <w:rFonts w:ascii="Courier New" w:hAnsi="Courier New" w:cs="Courier New" w:hint="default"/>
+      </w:rPr>
+    </w:lvl>
+    <w:lvl w:ilvl="5" w:tplc="04090005" w:tentative="1">
+      <w:start w:val="1"/>
+      <w:numFmt w:val="bullet"/>
+      <w:lvlText w:val=""/>
+      <w:lvlJc w:val="left"/>
+      <w:pPr>
+        <w:ind w:left="4620" w:hanging="360"/>
+      </w:pPr>
+      <w:rPr>
+        <w:rFonts w:ascii="Wingdings" w:hAnsi="Wingdings" w:hint="default"/>
+      </w:rPr>
+    </w:lvl>
+    <w:lvl w:ilvl="6" w:tplc="04090001" w:tentative="1">
+      <w:start w:val="1"/>
+      <w:numFmt w:val="bullet"/>
+      <w:lvlText w:val=""/>
+      <w:lvlJc w:val="left"/>
+      <w:pPr>
+        <w:ind w:left="5340" w:hanging="360"/>
+      </w:pPr>
+      <w:rPr>
+        <w:rFonts w:ascii="Symbol" w:hAnsi="Symbol" w:hint="default"/>
+      </w:rPr>
+    </w:lvl>
+    <w:lvl w:ilvl="7" w:tplc="04090003" w:tentative="1">
+      <w:start w:val="1"/>
+      <w:numFmt w:val="bullet"/>
+      <w:lvlText w:val="o"/>
+      <w:lvlJc w:val="left"/>
+      <w:pPr>
+        <w:ind w:left="6060" w:hanging="360"/>
+      </w:pPr>
+      <w:rPr>
+        <w:rFonts w:ascii="Courier New" w:hAnsi="Courier New" w:cs="Courier New" w:hint="default"/>
+      </w:rPr>
+    </w:lvl>
+    <w:lvl w:ilvl="8" w:tplc="04090005" w:tentative="1">
+      <w:start w:val="1"/>
+      <w:numFmt w:val="bullet"/>
+      <w:lvlText w:val=""/>
+      <w:lvlJc w:val="left"/>
+      <w:pPr>
+        <w:ind w:left="6780" w:hanging="360"/>
+      </w:pPr>
+      <w:rPr>
+        <w:rFonts w:ascii="Wingdings" w:hAnsi="Wingdings" w:hint="default"/>
+      </w:rPr>
+    </w:lvl>
+  </w:abstractNum>
+  <w:abstractNum w:abstractNumId="7" w15:restartNumberingAfterBreak="0">
     <w:nsid w:val="648473CC"/>
     <w:multiLevelType w:val="hybridMultilevel"/>
     <w:tmpl w:val="A59CF89A"/>
@@ -1429,23 +1570,266 @@
       <w:lvlJc w:val="left"/>
     </w:lvl>
   </w:abstractNum>
+  <w:abstractNum w:abstractNumId="8" w15:restartNumberingAfterBreak="0">
+    <w:nsid w:val="6C62316F"/>
+    <w:multiLevelType w:val="hybridMultilevel"/>
+    <w:tmpl w:val="36E8EA5A"/>
+    <w:lvl w:ilvl="0" w:tplc="2D94FCCE">
+      <w:numFmt w:val="bullet"/>
+      <w:lvlText w:val="–"/>
+      <w:lvlJc w:val="left"/>
+      <w:pPr>
+        <w:ind w:left="660" w:hanging="360"/>
+      </w:pPr>
+      <w:rPr>
+        <w:rFonts w:ascii="Calibri" w:eastAsia="Times New Roman" w:hAnsi="Calibri" w:cs="Calibri" w:hint="default"/>
+      </w:rPr>
+    </w:lvl>
+    <w:lvl w:ilvl="1" w:tplc="04090003" w:tentative="1">
+      <w:start w:val="1"/>
+      <w:numFmt w:val="bullet"/>
+      <w:lvlText w:val="o"/>
+      <w:lvlJc w:val="left"/>
+      <w:pPr>
+        <w:ind w:left="1380" w:hanging="360"/>
+      </w:pPr>
+      <w:rPr>
+        <w:rFonts w:ascii="Courier New" w:hAnsi="Courier New" w:cs="Courier New" w:hint="default"/>
+      </w:rPr>
+    </w:lvl>
+    <w:lvl w:ilvl="2" w:tplc="04090005" w:tentative="1">
+      <w:start w:val="1"/>
+      <w:numFmt w:val="bullet"/>
+      <w:lvlText w:val=""/>
+      <w:lvlJc w:val="left"/>
+      <w:pPr>
+        <w:ind w:left="2100" w:hanging="360"/>
+      </w:pPr>
+      <w:rPr>
+        <w:rFonts w:ascii="Wingdings" w:hAnsi="Wingdings" w:hint="default"/>
+      </w:rPr>
+    </w:lvl>
+    <w:lvl w:ilvl="3" w:tplc="04090001" w:tentative="1">
+      <w:start w:val="1"/>
+      <w:numFmt w:val="bullet"/>
+      <w:lvlText w:val=""/>
+      <w:lvlJc w:val="left"/>
+      <w:pPr>
+        <w:ind w:left="2820" w:hanging="360"/>
+      </w:pPr>
+      <w:rPr>
+        <w:rFonts w:ascii="Symbol" w:hAnsi="Symbol" w:hint="default"/>
+      </w:rPr>
+    </w:lvl>
+    <w:lvl w:ilvl="4" w:tplc="04090003" w:tentative="1">
+      <w:start w:val="1"/>
+      <w:numFmt w:val="bullet"/>
+      <w:lvlText w:val="o"/>
+      <w:lvlJc w:val="left"/>
+      <w:pPr>
+        <w:ind w:left="3540" w:hanging="360"/>
+      </w:pPr>
+      <w:rPr>
+        <w:rFonts w:ascii="Courier New" w:hAnsi="Courier New" w:cs="Courier New" w:hint="default"/>
+      </w:rPr>
+    </w:lvl>
+    <w:lvl w:ilvl="5" w:tplc="04090005" w:tentative="1">
+      <w:start w:val="1"/>
+      <w:numFmt w:val="bullet"/>
+      <w:lvlText w:val=""/>
+      <w:lvlJc w:val="left"/>
+      <w:pPr>
+        <w:ind w:left="4260" w:hanging="360"/>
+      </w:pPr>
+      <w:rPr>
+        <w:rFonts w:ascii="Wingdings" w:hAnsi="Wingdings" w:hint="default"/>
+      </w:rPr>
+    </w:lvl>
+    <w:lvl w:ilvl="6" w:tplc="04090001" w:tentative="1">
+      <w:start w:val="1"/>
+      <w:numFmt w:val="bullet"/>
+      <w:lvlText w:val=""/>
+      <w:lvlJc w:val="left"/>
+      <w:pPr>
+        <w:ind w:left="4980" w:hanging="360"/>
+      </w:pPr>
+      <w:rPr>
+        <w:rFonts w:ascii="Symbol" w:hAnsi="Symbol" w:hint="default"/>
+      </w:rPr>
+    </w:lvl>
+    <w:lvl w:ilvl="7" w:tplc="04090003" w:tentative="1">
+      <w:start w:val="1"/>
+      <w:numFmt w:val="bullet"/>
+      <w:lvlText w:val="o"/>
+      <w:lvlJc w:val="left"/>
+      <w:pPr>
+        <w:ind w:left="5700" w:hanging="360"/>
+      </w:pPr>
+      <w:rPr>
+        <w:rFonts w:ascii="Courier New" w:hAnsi="Courier New" w:cs="Courier New" w:hint="default"/>
+      </w:rPr>
+    </w:lvl>
+    <w:lvl w:ilvl="8" w:tplc="04090005" w:tentative="1">
+      <w:start w:val="1"/>
+      <w:numFmt w:val="bullet"/>
+      <w:lvlText w:val=""/>
+      <w:lvlJc w:val="left"/>
+      <w:pPr>
+        <w:ind w:left="6420" w:hanging="360"/>
+      </w:pPr>
+      <w:rPr>
+        <w:rFonts w:ascii="Wingdings" w:hAnsi="Wingdings" w:hint="default"/>
+      </w:rPr>
+    </w:lvl>
+  </w:abstractNum>
+  <w:abstractNum w:abstractNumId="9" w15:restartNumberingAfterBreak="0">
+    <w:nsid w:val="7A6E21F0"/>
+    <w:multiLevelType w:val="hybridMultilevel"/>
+    <w:tmpl w:val="DF6A7436"/>
+    <w:lvl w:ilvl="0" w:tplc="B4B4031E">
+      <w:numFmt w:val="bullet"/>
+      <w:lvlText w:val=""/>
+      <w:lvlJc w:val="left"/>
+      <w:pPr>
+        <w:ind w:left="660" w:hanging="360"/>
+      </w:pPr>
+      <w:rPr>
+        <w:rFonts w:ascii="Wingdings" w:eastAsia="Times New Roman" w:hAnsi="Wingdings" w:cs="Calibri" w:hint="default"/>
+        <w:color w:val="auto"/>
+      </w:rPr>
+    </w:lvl>
+    <w:lvl w:ilvl="1" w:tplc="04090003" w:tentative="1">
+      <w:start w:val="1"/>
+      <w:numFmt w:val="bullet"/>
+      <w:lvlText w:val="o"/>
+      <w:lvlJc w:val="left"/>
+      <w:pPr>
+        <w:ind w:left="1380" w:hanging="360"/>
+      </w:pPr>
+      <w:rPr>
+        <w:rFonts w:ascii="Courier New" w:hAnsi="Courier New" w:cs="Courier New" w:hint="default"/>
+      </w:rPr>
+    </w:lvl>
+    <w:lvl w:ilvl="2" w:tplc="04090005" w:tentative="1">
+      <w:start w:val="1"/>
+      <w:numFmt w:val="bullet"/>
+      <w:lvlText w:val=""/>
+      <w:lvlJc w:val="left"/>
+      <w:pPr>
+        <w:ind w:left="2100" w:hanging="360"/>
+      </w:pPr>
+      <w:rPr>
+        <w:rFonts w:ascii="Wingdings" w:hAnsi="Wingdings" w:hint="default"/>
+      </w:rPr>
+    </w:lvl>
+    <w:lvl w:ilvl="3" w:tplc="04090001" w:tentative="1">
+      <w:start w:val="1"/>
+      <w:numFmt w:val="bullet"/>
+      <w:lvlText w:val=""/>
+      <w:lvlJc w:val="left"/>
+      <w:pPr>
+        <w:ind w:left="2820" w:hanging="360"/>
+      </w:pPr>
+      <w:rPr>
+        <w:rFonts w:ascii="Symbol" w:hAnsi="Symbol" w:hint="default"/>
+      </w:rPr>
+    </w:lvl>
+    <w:lvl w:ilvl="4" w:tplc="04090003" w:tentative="1">
+      <w:start w:val="1"/>
+      <w:numFmt w:val="bullet"/>
+      <w:lvlText w:val="o"/>
+      <w:lvlJc w:val="left"/>
+      <w:pPr>
+        <w:ind w:left="3540" w:hanging="360"/>
+      </w:pPr>
+      <w:rPr>
+        <w:rFonts w:ascii="Courier New" w:hAnsi="Courier New" w:cs="Courier New" w:hint="default"/>
+      </w:rPr>
+    </w:lvl>
+    <w:lvl w:ilvl="5" w:tplc="04090005" w:tentative="1">
+      <w:start w:val="1"/>
+      <w:numFmt w:val="bullet"/>
+      <w:lvlText w:val=""/>
+      <w:lvlJc w:val="left"/>
+      <w:pPr>
+        <w:ind w:left="4260" w:hanging="360"/>
+      </w:pPr>
+      <w:rPr>
+        <w:rFonts w:ascii="Wingdings" w:hAnsi="Wingdings" w:hint="default"/>
+      </w:rPr>
+    </w:lvl>
+    <w:lvl w:ilvl="6" w:tplc="04090001" w:tentative="1">
+      <w:start w:val="1"/>
+      <w:numFmt w:val="bullet"/>
+      <w:lvlText w:val=""/>
+      <w:lvlJc w:val="left"/>
+      <w:pPr>
+        <w:ind w:left="4980" w:hanging="360"/>
+      </w:pPr>
+      <w:rPr>
+        <w:rFonts w:ascii="Symbol" w:hAnsi="Symbol" w:hint="default"/>
+      </w:rPr>
+    </w:lvl>
+    <w:lvl w:ilvl="7" w:tplc="04090003" w:tentative="1">
+      <w:start w:val="1"/>
+      <w:numFmt w:val="bullet"/>
+      <w:lvlText w:val="o"/>
+      <w:lvlJc w:val="left"/>
+      <w:pPr>
+        <w:ind w:left="5700" w:hanging="360"/>
+      </w:pPr>
+      <w:rPr>
+        <w:rFonts w:ascii="Courier New" w:hAnsi="Courier New" w:cs="Courier New" w:hint="default"/>
+      </w:rPr>
+    </w:lvl>
+    <w:lvl w:ilvl="8" w:tplc="04090005" w:tentative="1">
+      <w:start w:val="1"/>
+      <w:numFmt w:val="bullet"/>
+      <w:lvlText w:val=""/>
+      <w:lvlJc w:val="left"/>
+      <w:pPr>
+        <w:ind w:left="6420" w:hanging="360"/>
+      </w:pPr>
+      <w:rPr>
+        <w:rFonts w:ascii="Wingdings" w:hAnsi="Wingdings" w:hint="default"/>
+      </w:rPr>
+    </w:lvl>
+  </w:abstractNum>
   <w:num w:numId="1" w16cid:durableId="27416122">
-    <w:abstractNumId w:val="1"/>
+    <w:abstractNumId w:val="2"/>
     <w:lvlOverride w:ilvl="0">
       <w:startOverride w:val="1"/>
     </w:lvlOverride>
   </w:num>
   <w:num w:numId="2" w16cid:durableId="1338539101">
-    <w:abstractNumId w:val="3"/>
+    <w:abstractNumId w:val="7"/>
   </w:num>
   <w:num w:numId="3" w16cid:durableId="1664429592">
-    <w:abstractNumId w:val="3"/>
+    <w:abstractNumId w:val="7"/>
   </w:num>
   <w:num w:numId="4" w16cid:durableId="692847783">
     <w:abstractNumId w:val="0"/>
   </w:num>
   <w:num w:numId="5" w16cid:durableId="691957315">
-    <w:abstractNumId w:val="2"/>
+    <w:abstractNumId w:val="4"/>
+  </w:num>
+  <w:num w:numId="6" w16cid:durableId="443765448">
+    <w:abstractNumId w:val="8"/>
+  </w:num>
+  <w:num w:numId="7" w16cid:durableId="1965430008">
+    <w:abstractNumId w:val="3"/>
+  </w:num>
+  <w:num w:numId="8" w16cid:durableId="897323558">
+    <w:abstractNumId w:val="5"/>
+  </w:num>
+  <w:num w:numId="9" w16cid:durableId="1603804135">
+    <w:abstractNumId w:val="1"/>
+  </w:num>
+  <w:num w:numId="10" w16cid:durableId="1932007350">
+    <w:abstractNumId w:val="6"/>
+  </w:num>
+  <w:num w:numId="11" w16cid:durableId="476343865">
+    <w:abstractNumId w:val="9"/>
   </w:num>
 </w:numbering>
 </file>

</xml_diff>

<commit_message>
Add clickable portfolio link to resume
Co-Authored-By: Claude Opus 5.5 <noreply@anthropic.com>
Claude-Session: https://claude.ai/code/session_013UyyijYyJ4sxi2dBgmcKP7
</commit_message>
<xml_diff>
--- a/assets/Vedant_Nemade_Resume.docx
+++ b/assets/Vedant_Nemade_Resume.docx
@@ -75,6 +75,36 @@
             <w:szCs w:val="22"/>
           </w:rPr>
           <w:t>vedantnemade70@gmail.com</w:t>
+        </w:r>
+      </w:hyperlink>
+    </w:p>
+    <w:p>
+      <w:pPr>
+        <w:jc w:val="center"/>
+        <w:rPr>
+          <w:rFonts w:ascii="Calibri" w:hAnsi="Calibri" w:cs="Calibri"/>
+          <w:sz w:val="22"/>
+          <w:szCs w:val="22"/>
+        </w:rPr>
+      </w:pPr>
+      <w:r>
+        <w:rPr>
+          <w:rFonts w:ascii="Calibri" w:hAnsi="Calibri" w:cs="Calibri"/>
+          <w:color w:val="5A5A5A"/>
+          <w:sz w:val="22"/>
+          <w:szCs w:val="22"/>
+        </w:rPr>
+        <w:t xml:space="preserve">Portfolio: </w:t>
+      </w:r>
+      <w:hyperlink r:id="rId8" w:history="1">
+        <w:r>
+          <w:rPr>
+            <w:rStyle w:val="Hyperlink"/>
+            <w:rFonts w:ascii="Calibri" w:hAnsi="Calibri" w:cs="Calibri"/>
+            <w:sz w:val="22"/>
+            <w:szCs w:val="22"/>
+          </w:rPr>
+          <w:t>vedantnemade70.github.io/vedantnemade70</w:t>
         </w:r>
       </w:hyperlink>
     </w:p>

</xml_diff>

<commit_message>
Link the word "Portfolio" in resume instead of showing the URL
Co-Authored-By: Claude Opus 5.5 <noreply@anthropic.com>
Claude-Session: https://claude.ai/code/session_013UyyijYyJ4sxi2dBgmcKP7
</commit_message>
<xml_diff>
--- a/assets/Vedant_Nemade_Resume.docx
+++ b/assets/Vedant_Nemade_Resume.docx
@@ -87,15 +87,6 @@
           <w:szCs w:val="22"/>
         </w:rPr>
       </w:pPr>
-      <w:r>
-        <w:rPr>
-          <w:rFonts w:ascii="Calibri" w:hAnsi="Calibri" w:cs="Calibri"/>
-          <w:color w:val="5A5A5A"/>
-          <w:sz w:val="22"/>
-          <w:szCs w:val="22"/>
-        </w:rPr>
-        <w:t xml:space="preserve">Portfolio: </w:t>
-      </w:r>
       <w:hyperlink r:id="rId8" w:history="1">
         <w:r>
           <w:rPr>
@@ -104,7 +95,7 @@
             <w:sz w:val="22"/>
             <w:szCs w:val="22"/>
           </w:rPr>
-          <w:t>vedantnemade70.github.io/vedantnemade70</w:t>
+          <w:t>Portfolio</w:t>
         </w:r>
       </w:hyperlink>
     </w:p>

</xml_diff>